<commit_message>
fix(task-sheet): add missing Word template files for all inspection sheets
The .docx template files existed locally but had never been committed to the repository, causing a 400 error when trying to render any inspection sheet Word document.

Co-authored-by: Cursor <cursoragent@cursor.com>
</commit_message>
<xml_diff>
--- a/bi-biz/src/main/resources/word.biz/桥梁结构桥梁技术状况检测记录表.docx
+++ b/bi-biz/src/main/resources/word.biz/桥梁结构桥梁技术状况检测记录表.docx
@@ -146,6 +146,12 @@
             <w:insideH w:val="single" w:color="000000" w:sz="2" w:space="0"/>
             <w:insideV w:val="single" w:color="000000" w:sz="2" w:space="0"/>
           </w:tblBorders>
+          <w:tblCellMar>
+            <w:top w:w="0" w:type="dxa"/>
+            <w:left w:w="0" w:type="dxa"/>
+            <w:bottom w:w="0" w:type="dxa"/>
+            <w:right w:w="0" w:type="dxa"/>
+          </w:tblCellMar>
         </w:tblPrEx>
         <w:trPr>
           <w:trHeight w:val="518" w:hRule="atLeast"/>
@@ -2270,6 +2276,12 @@
             <w:insideH w:val="single" w:color="000000" w:sz="2" w:space="0"/>
             <w:insideV w:val="single" w:color="000000" w:sz="2" w:space="0"/>
           </w:tblBorders>
+          <w:tblCellMar>
+            <w:top w:w="0" w:type="dxa"/>
+            <w:left w:w="0" w:type="dxa"/>
+            <w:bottom w:w="0" w:type="dxa"/>
+            <w:right w:w="0" w:type="dxa"/>
+          </w:tblCellMar>
         </w:tblPrEx>
         <w:trPr>
           <w:trHeight w:val="513" w:hRule="atLeast"/>
@@ -3448,24 +3460,15 @@
     </w:tbl>
     <w:p>
       <w:pPr>
-        <w:widowControl w:val="0"/>
-        <w:kinsoku/>
         <w:wordWrap w:val="0"/>
-        <w:autoSpaceDE/>
-        <w:autoSpaceDN/>
-        <w:adjustRightInd/>
-        <w:snapToGrid/>
-        <w:spacing w:line="240" w:lineRule="auto"/>
-        <w:ind w:firstLine="100" w:firstLineChars="50"/>
-        <w:jc w:val="both"/>
-        <w:textAlignment w:val="auto"/>
+        <w:ind w:firstLine="105" w:firstLineChars="50"/>
         <w:rPr>
           <w:rFonts w:hint="eastAsia" w:ascii="Times New Roman" w:hAnsi="Times New Roman" w:eastAsia="宋体" w:cs="Times New Roman"/>
           <w:bCs/>
           <w:snapToGrid/>
           <w:kern w:val="2"/>
-          <w:sz w:val="20"/>
-          <w:szCs w:val="24"/>
+          <w:sz w:val="21"/>
+          <w:szCs w:val="21"/>
           <w:lang w:val="en-US" w:eastAsia="zh-CN"/>
         </w:rPr>
       </w:pPr>
@@ -3475,11 +3478,25 @@
           <w:bCs/>
           <w:snapToGrid/>
           <w:kern w:val="2"/>
-          <w:sz w:val="20"/>
-          <w:szCs w:val="24"/>
+          <w:sz w:val="21"/>
+          <w:szCs w:val="21"/>
           <w:lang w:val="en-US" w:eastAsia="zh-CN"/>
         </w:rPr>
-        <w:t>检测：               记录：                复核：                                                                              日期：       年   月   日</w:t>
+        <w:t xml:space="preserve">检测：                             记录：                复核：                                     </w:t>
+      </w:r>
+      <w:bookmarkStart w:id="0" w:name="_GoBack"/>
+      <w:bookmarkEnd w:id="0"/>
+      <w:r>
+        <w:rPr>
+          <w:rFonts w:hint="eastAsia" w:ascii="Times New Roman" w:hAnsi="Times New Roman" w:eastAsia="宋体" w:cs="Times New Roman"/>
+          <w:bCs/>
+          <w:snapToGrid/>
+          <w:kern w:val="2"/>
+          <w:sz w:val="21"/>
+          <w:szCs w:val="21"/>
+          <w:lang w:val="en-US" w:eastAsia="zh-CN"/>
+        </w:rPr>
+        <w:t xml:space="preserve">  日期：         年         月          日</w:t>
       </w:r>
     </w:p>
     <w:sectPr>
@@ -3671,8 +3688,8 @@
     <w:lsdException w:unhideWhenUsed="0" w:uiPriority="0" w:semiHidden="0" w:name="Normal Indent"/>
     <w:lsdException w:unhideWhenUsed="0" w:uiPriority="0" w:semiHidden="0" w:name="footnote text"/>
     <w:lsdException w:unhideWhenUsed="0" w:uiPriority="0" w:semiHidden="0" w:name="annotation text"/>
-    <w:lsdException w:unhideWhenUsed="0" w:uiPriority="0" w:semiHidden="0" w:name="header"/>
-    <w:lsdException w:unhideWhenUsed="0" w:uiPriority="0" w:semiHidden="0" w:name="footer"/>
+    <w:lsdException w:qFormat="1" w:unhideWhenUsed="0" w:uiPriority="0" w:semiHidden="0" w:name="header"/>
+    <w:lsdException w:qFormat="1" w:unhideWhenUsed="0" w:uiPriority="0" w:semiHidden="0" w:name="footer"/>
     <w:lsdException w:unhideWhenUsed="0" w:uiPriority="0" w:semiHidden="0" w:name="index heading"/>
     <w:lsdException w:qFormat="1" w:uiPriority="0" w:name="caption"/>
     <w:lsdException w:unhideWhenUsed="0" w:uiPriority="0" w:semiHidden="0" w:name="table of figures"/>
@@ -3950,6 +3967,7 @@
   <w:style w:type="paragraph" w:styleId="3">
     <w:name w:val="footer"/>
     <w:basedOn w:val="1"/>
+    <w:qFormat/>
     <w:uiPriority w:val="0"/>
     <w:pPr>
       <w:tabs>
@@ -3966,6 +3984,7 @@
   <w:style w:type="paragraph" w:styleId="4">
     <w:name w:val="header"/>
     <w:basedOn w:val="1"/>
+    <w:qFormat/>
     <w:uiPriority w:val="0"/>
     <w:pPr>
       <w:pBdr>

</xml_diff>